<commit_message>
phase3 to phase5 update
</commit_message>
<xml_diff>
--- a/output/IS-001 資訊安全政策.docx
+++ b/output/IS-001 資訊安全政策.docx
@@ -38,7 +38,7 @@
         </w:rPr>
       </w:pPr>
       <w:r>
-        <w:t xml:space="preserve">新世紀虛擬科技股份有限公司</w:t>
+        <w:t xml:space="preserve">E2E測試科技股份有限公司</w:t>
       </w:r>
     </w:p>
     <w:p>
@@ -299,7 +299,7 @@
         </w:rPr>
       </w:pPr>
       <w:r>
-        <w:t xml:space="preserve">發行日期：2026/05/20</w:t>
+        <w:t xml:space="preserve">發行日期：2026/03/06</w:t>
       </w:r>
     </w:p>
     <w:p>
@@ -563,7 +563,7 @@
               </w:rPr>
             </w:pPr>
             <w:r>
-              <w:t xml:space="preserve">2026/05/20</w:t>
+              <w:t xml:space="preserve">2026/03/06</w:t>
             </w:r>
           </w:p>
         </w:tc>
@@ -2144,7 +2144,7 @@
         </w:rPr>
       </w:pPr>
       <w:r>
-        <w:t xml:space="preserve">確保新世紀虛擬科技股份有限公司（以下簡稱本公司）所屬之資訊資產的機密性、完整性及可用性，並符合相關法規之要求，使其免於遭受內、外部的蓄意或意外之威脅。</w:t>
+        <w:t xml:space="preserve">確保E2E測試科技股份有限公司（以下簡稱本公司）所屬之資訊資產的機密性、完整性及可用性，並符合相關法規之要求，使其免於遭受內、外部的蓄意或意外之威脅。</w:t>
       </w:r>
     </w:p>
     <w:p>

</xml_diff>